<commit_message>
Added github repo to report
</commit_message>
<xml_diff>
--- a/report/BIAI-MR-ML-FINAL-REPORT.docx
+++ b/report/BIAI-MR-ML-FINAL-REPORT.docx
@@ -162,6 +162,7 @@
           <w:lang w:val="en-GB"/>
         </w:rPr>
       </w:pPr>
+      <w:proofErr w:type="spellStart"/>
       <w:r>
         <w:rPr>
           <w:rFonts w:asciiTheme="majorHAnsi" w:hAnsiTheme="majorHAnsi" w:cs="Arial"/>
@@ -171,6 +172,7 @@
         </w:rPr>
         <w:t>Iga_Świątek_Funclub</w:t>
       </w:r>
+      <w:proofErr w:type="spellEnd"/>
     </w:p>
     <w:p>
       <w:pPr>
@@ -240,14 +242,12 @@
         <w:rPr>
           <w:rFonts w:asciiTheme="minorHAnsi" w:hAnsiTheme="minorHAnsi" w:cstheme="minorHAnsi"/>
           <w:sz w:val="24"/>
-          <w:lang w:val="en-GB"/>
         </w:rPr>
       </w:pPr>
       <w:r>
         <w:rPr>
           <w:rFonts w:asciiTheme="minorHAnsi" w:hAnsiTheme="minorHAnsi" w:cstheme="minorHAnsi"/>
           <w:sz w:val="24"/>
-          <w:lang w:val="en-GB"/>
         </w:rPr>
         <w:t>Magdalena Rąpała</w:t>
       </w:r>
@@ -259,14 +259,12 @@
         <w:rPr>
           <w:rFonts w:asciiTheme="minorHAnsi" w:hAnsiTheme="minorHAnsi" w:cstheme="minorHAnsi"/>
           <w:sz w:val="24"/>
-          <w:lang w:val="en-GB"/>
         </w:rPr>
       </w:pPr>
       <w:r>
         <w:rPr>
           <w:rFonts w:asciiTheme="minorHAnsi" w:hAnsiTheme="minorHAnsi" w:cstheme="minorHAnsi"/>
           <w:sz w:val="24"/>
-          <w:lang w:val="en-GB"/>
         </w:rPr>
         <w:t>Miłosz Liniewiecki</w:t>
       </w:r>
@@ -278,7 +276,6 @@
         <w:rPr>
           <w:rFonts w:asciiTheme="minorHAnsi" w:hAnsiTheme="minorHAnsi" w:cstheme="minorHAnsi"/>
           <w:sz w:val="24"/>
-          <w:lang w:val="en-GB"/>
         </w:rPr>
       </w:pPr>
     </w:p>
@@ -289,7 +286,6 @@
         <w:rPr>
           <w:rFonts w:asciiTheme="minorHAnsi" w:hAnsiTheme="minorHAnsi" w:cstheme="minorHAnsi"/>
           <w:sz w:val="24"/>
-          <w:lang w:val="en-GB"/>
         </w:rPr>
       </w:pPr>
     </w:p>
@@ -300,7 +296,6 @@
         <w:rPr>
           <w:rFonts w:asciiTheme="minorHAnsi" w:hAnsiTheme="minorHAnsi" w:cstheme="minorHAnsi"/>
           <w:sz w:val="24"/>
-          <w:lang w:val="en-GB"/>
         </w:rPr>
       </w:pPr>
     </w:p>
@@ -310,14 +305,12 @@
         <w:rPr>
           <w:rFonts w:asciiTheme="minorHAnsi" w:hAnsiTheme="minorHAnsi" w:cstheme="minorHAnsi"/>
           <w:sz w:val="24"/>
-          <w:lang w:val="en-GB"/>
         </w:rPr>
       </w:pPr>
       <w:r>
         <w:rPr>
           <w:rFonts w:asciiTheme="minorHAnsi" w:hAnsiTheme="minorHAnsi" w:cstheme="minorHAnsi"/>
           <w:sz w:val="24"/>
-          <w:lang w:val="en-GB"/>
         </w:rPr>
         <w:t>Gliwice, 18.06.2026</w:t>
       </w:r>
@@ -365,7 +358,117 @@
           <w:szCs w:val="20"/>
           <w:lang w:val="en-GB"/>
         </w:rPr>
-        <w:t xml:space="preserve">The scope of this project involved training a neural network to play an Atari game using a genetic algorithm. We selected the Atari Tennis game as our target environment. To implement and train the artificial player, we utilized the Arcade Learning Environment (ALE) framework and the PyGad library. </w:t>
+        <w:t xml:space="preserve">The scope of this project involved training a neural network to play an Atari game using a genetic algorithm. We selected the Atari Tennis game as our target environment. To implement and train the artificial player, we utilized the Arcade Learning Environment (ALE) framework and the </w:t>
+      </w:r>
+      <w:proofErr w:type="spellStart"/>
+      <w:r>
+        <w:rPr>
+          <w:rFonts w:asciiTheme="minorHAnsi" w:hAnsiTheme="minorHAnsi" w:cstheme="minorHAnsi"/>
+          <w:sz w:val="20"/>
+          <w:szCs w:val="20"/>
+          <w:lang w:val="en-GB"/>
+        </w:rPr>
+        <w:t>PyGad</w:t>
+      </w:r>
+      <w:proofErr w:type="spellEnd"/>
+      <w:r>
+        <w:rPr>
+          <w:rFonts w:asciiTheme="minorHAnsi" w:hAnsiTheme="minorHAnsi" w:cstheme="minorHAnsi"/>
+          <w:sz w:val="20"/>
+          <w:szCs w:val="20"/>
+          <w:lang w:val="en-GB"/>
+        </w:rPr>
+        <w:t xml:space="preserve"> library. </w:t>
+      </w:r>
+    </w:p>
+    <w:p>
+      <w:pPr>
+        <w:ind w:firstLine="708"/>
+        <w:jc w:val="left"/>
+        <w:rPr>
+          <w:rFonts w:asciiTheme="minorHAnsi" w:hAnsiTheme="minorHAnsi" w:cstheme="minorHAnsi"/>
+          <w:sz w:val="20"/>
+          <w:szCs w:val="20"/>
+          <w:lang w:val="en-GB"/>
+        </w:rPr>
+      </w:pPr>
+      <w:r>
+        <w:rPr>
+          <w:rFonts w:asciiTheme="minorHAnsi" w:hAnsiTheme="minorHAnsi" w:cstheme="minorHAnsi"/>
+          <w:sz w:val="20"/>
+          <w:szCs w:val="20"/>
+          <w:lang w:val="en-GB"/>
+        </w:rPr>
+        <w:t xml:space="preserve">The final version of the project can be found here: </w:t>
+      </w:r>
+      <w:sdt>
+        <w:sdtPr>
+          <w:rPr>
+            <w:rFonts w:asciiTheme="minorHAnsi" w:hAnsiTheme="minorHAnsi" w:cstheme="minorHAnsi"/>
+            <w:sz w:val="20"/>
+            <w:szCs w:val="20"/>
+            <w:lang w:val="en-GB"/>
+          </w:rPr>
+          <w:id w:val="-177896502"/>
+          <w:citation/>
+        </w:sdtPr>
+        <w:sdtContent>
+          <w:r>
+            <w:rPr>
+              <w:rFonts w:asciiTheme="minorHAnsi" w:hAnsiTheme="minorHAnsi" w:cstheme="minorHAnsi"/>
+              <w:sz w:val="20"/>
+              <w:szCs w:val="20"/>
+              <w:lang w:val="en-GB"/>
+            </w:rPr>
+            <w:fldChar w:fldCharType="begin"/>
+          </w:r>
+          <w:r>
+            <w:rPr>
+              <w:rFonts w:asciiTheme="minorHAnsi" w:hAnsiTheme="minorHAnsi" w:cstheme="minorHAnsi"/>
+              <w:sz w:val="20"/>
+              <w:szCs w:val="20"/>
+              <w:lang w:val="en-GB"/>
+            </w:rPr>
+            <w:instrText xml:space="preserve"> CITATION htt13 \l 1045 </w:instrText>
+          </w:r>
+          <w:r>
+            <w:rPr>
+              <w:rFonts w:asciiTheme="minorHAnsi" w:hAnsiTheme="minorHAnsi" w:cstheme="minorHAnsi"/>
+              <w:sz w:val="20"/>
+              <w:szCs w:val="20"/>
+              <w:lang w:val="en-GB"/>
+            </w:rPr>
+            <w:fldChar w:fldCharType="separate"/>
+          </w:r>
+          <w:r>
+            <w:rPr>
+              <w:rFonts w:asciiTheme="minorHAnsi" w:hAnsiTheme="minorHAnsi" w:cstheme="minorHAnsi"/>
+              <w:noProof/>
+              <w:sz w:val="20"/>
+              <w:szCs w:val="20"/>
+              <w:lang w:val="en-GB"/>
+            </w:rPr>
+            <w:t>(1)</w:t>
+          </w:r>
+          <w:r>
+            <w:rPr>
+              <w:rFonts w:asciiTheme="minorHAnsi" w:hAnsiTheme="minorHAnsi" w:cstheme="minorHAnsi"/>
+              <w:sz w:val="20"/>
+              <w:szCs w:val="20"/>
+              <w:lang w:val="en-GB"/>
+            </w:rPr>
+            <w:fldChar w:fldCharType="end"/>
+          </w:r>
+        </w:sdtContent>
+      </w:sdt>
+      <w:r>
+        <w:rPr>
+          <w:rFonts w:asciiTheme="minorHAnsi" w:hAnsiTheme="minorHAnsi" w:cstheme="minorHAnsi"/>
+          <w:sz w:val="20"/>
+          <w:szCs w:val="20"/>
+          <w:lang w:val="en-GB"/>
+        </w:rPr>
+        <w:t>.</w:t>
       </w:r>
     </w:p>
     <w:p>
@@ -600,7 +703,6 @@
           <w:szCs w:val="28"/>
           <w:lang w:val="en-GB"/>
         </w:rPr>
-        <w:lastRenderedPageBreak/>
         <w:t>Neural Network</w:t>
       </w:r>
     </w:p>
@@ -1019,7 +1121,27 @@
           <w:szCs w:val="20"/>
           <w:lang w:val="en-GB"/>
         </w:rPr>
-        <w:t xml:space="preserve">To ensure stable signal propagation and variance throughout the layers during initialization, we applied Xavier initialization to set the network's weights. The final layer applies a softmax activation function to compute a probability distribution over the available actions, which are then mapped to the positional movements from Figure 1. </w:t>
+        <w:t xml:space="preserve">To ensure stable signal propagation and variance throughout the layers during initialization, we applied Xavier initialization to set the network's weights. The final layer applies a </w:t>
+      </w:r>
+      <w:proofErr w:type="spellStart"/>
+      <w:r>
+        <w:rPr>
+          <w:rFonts w:asciiTheme="minorHAnsi" w:hAnsiTheme="minorHAnsi" w:cstheme="minorHAnsi"/>
+          <w:sz w:val="20"/>
+          <w:szCs w:val="20"/>
+          <w:lang w:val="en-GB"/>
+        </w:rPr>
+        <w:t>softmax</w:t>
+      </w:r>
+      <w:proofErr w:type="spellEnd"/>
+      <w:r>
+        <w:rPr>
+          <w:rFonts w:asciiTheme="minorHAnsi" w:hAnsiTheme="minorHAnsi" w:cstheme="minorHAnsi"/>
+          <w:sz w:val="20"/>
+          <w:szCs w:val="20"/>
+          <w:lang w:val="en-GB"/>
+        </w:rPr>
+        <w:t xml:space="preserve"> activation function to compute a probability distribution over the available actions, which are then mapped to the positional movements from Figure 1. </w:t>
       </w:r>
     </w:p>
     <w:p>
@@ -1064,7 +1186,27 @@
           <w:szCs w:val="20"/>
           <w:lang w:val="en-GB"/>
         </w:rPr>
-        <w:t xml:space="preserve">We employed the PyGad module to evolve the neural network populations, subsequently isolating the fittest individual for standalone performance testing. Genetic algorithms rely on a highly structured optimization pipeline that requires careful hyperparameter calibration. The configuration code block below highlights the setup used during our training trials. </w:t>
+        <w:t xml:space="preserve">We employed the </w:t>
+      </w:r>
+      <w:proofErr w:type="spellStart"/>
+      <w:r>
+        <w:rPr>
+          <w:rFonts w:cstheme="minorHAnsi"/>
+          <w:sz w:val="20"/>
+          <w:szCs w:val="20"/>
+          <w:lang w:val="en-GB"/>
+        </w:rPr>
+        <w:t>PyGad</w:t>
+      </w:r>
+      <w:proofErr w:type="spellEnd"/>
+      <w:r>
+        <w:rPr>
+          <w:rFonts w:cstheme="minorHAnsi"/>
+          <w:sz w:val="20"/>
+          <w:szCs w:val="20"/>
+          <w:lang w:val="en-GB"/>
+        </w:rPr>
+        <w:t xml:space="preserve"> module to evolve the neural network populations, subsequently isolating the fittest individual for standalone performance testing. Genetic algorithms rely on a highly structured optimization pipeline that requires careful hyperparameter calibration. The configuration code block below highlights the setup used during our training trials. </w:t>
       </w:r>
     </w:p>
     <w:p>
@@ -1080,6 +1222,7 @@
       <w:r>
         <w:rPr>
           <w:rFonts w:cstheme="minorHAnsi"/>
+          <w:noProof/>
           <w:sz w:val="20"/>
           <w:szCs w:val="20"/>
           <w:lang w:val="en-GB"/>
@@ -1132,10 +1275,12 @@
       <w:r>
         <w:rPr>
           <w:rFonts w:cstheme="minorHAnsi"/>
-          <w:sz w:val="20"/>
-          <w:szCs w:val="20"/>
-          <w:lang w:val="en-GB"/>
-        </w:rPr>
+          <w:noProof/>
+          <w:sz w:val="20"/>
+          <w:szCs w:val="20"/>
+          <w:lang w:val="en-GB"/>
+        </w:rPr>
+        <w:lastRenderedPageBreak/>
         <w:drawing>
           <wp:inline distT="0" distB="0" distL="0" distR="0" wp14:anchorId="53266504" wp14:editId="02FE3E39">
             <wp:extent cx="2235315" cy="2095608"/>
@@ -1255,7 +1400,6 @@
           <w:szCs w:val="20"/>
           <w:lang w:val="en-GB"/>
         </w:rPr>
-        <w:lastRenderedPageBreak/>
         <w:t xml:space="preserve">During development, we experimented with the mutation mechanics. Initially, uniform random replacements were applied to mutated genes, but this proved highly detrimental to the structural stability of the networks. Swapping up to 20% of all weights with completely random values disrupted learned </w:t>
       </w:r>
       <w:r>
@@ -1378,16 +1522,7 @@
               <w:szCs w:val="20"/>
               <w:lang w:val="en-GB"/>
             </w:rPr>
-            <m:t>f</m:t>
-          </m:r>
-          <m:r>
-            <w:rPr>
-              <w:rFonts w:ascii="Cambria Math" w:hAnsi="Cambria Math" w:cstheme="minorHAnsi"/>
-              <w:sz w:val="20"/>
-              <w:szCs w:val="20"/>
-              <w:lang w:val="en-GB"/>
-            </w:rPr>
-            <m:t xml:space="preserve">= </m:t>
+            <m:t xml:space="preserve">f= </m:t>
           </m:r>
           <m:nary>
             <m:naryPr>
@@ -1508,6 +1643,9 @@
             <m:t>)</m:t>
           </m:r>
           <m:r>
+            <m:rPr>
+              <m:sty m:val="p"/>
+            </m:rPr>
             <w:rPr>
               <w:rFonts w:ascii="Cambria Math" w:hAnsi="Cambria Math" w:cstheme="minorHAnsi"/>
               <w:sz w:val="20"/>
@@ -1595,16 +1733,7 @@
               <w:szCs w:val="20"/>
               <w:lang w:val="en-GB"/>
             </w:rPr>
-            <m:t xml:space="preserve">, </m:t>
-          </m:r>
-          <m:r>
-            <w:rPr>
-              <w:rFonts w:ascii="Cambria Math" w:hAnsi="Cambria Math" w:cstheme="minorHAnsi"/>
-              <w:sz w:val="20"/>
-              <w:szCs w:val="20"/>
-              <w:lang w:val="en-GB"/>
-            </w:rPr>
-            <m:t>f ∈[0, 3]</m:t>
+            <m:t>, f ∈[0, 3]</m:t>
           </m:r>
         </m:oMath>
       </m:oMathPara>
@@ -1774,7 +1903,27 @@
           <w:szCs w:val="20"/>
           <w:lang w:val="en-GB"/>
         </w:rPr>
-        <w:t xml:space="preserve"> i-th </w:t>
+        <w:t xml:space="preserve"> </w:t>
+      </w:r>
+      <w:proofErr w:type="spellStart"/>
+      <w:r>
+        <w:rPr>
+          <w:rFonts w:asciiTheme="minorHAnsi" w:hAnsiTheme="minorHAnsi" w:cstheme="minorHAnsi"/>
+          <w:sz w:val="20"/>
+          <w:szCs w:val="20"/>
+          <w:lang w:val="en-GB"/>
+        </w:rPr>
+        <w:t>i-th</w:t>
+      </w:r>
+      <w:proofErr w:type="spellEnd"/>
+      <w:r>
+        <w:rPr>
+          <w:rFonts w:asciiTheme="minorHAnsi" w:hAnsiTheme="minorHAnsi" w:cstheme="minorHAnsi"/>
+          <w:sz w:val="20"/>
+          <w:szCs w:val="20"/>
+          <w:lang w:val="en-GB"/>
+        </w:rPr>
+        <w:t xml:space="preserve"> </w:t>
       </w:r>
       <w:r>
         <w:rPr>
@@ -3152,7 +3301,6 @@
           <w:szCs w:val="20"/>
           <w:lang w:val="en-GB"/>
         </w:rPr>
-        <w:lastRenderedPageBreak/>
         <w:t>.</w:t>
       </w:r>
       <w:r>
@@ -3193,25 +3341,7 @@
           <w:szCs w:val="20"/>
           <w:lang w:val="en-GB"/>
         </w:rPr>
-        <w:t xml:space="preserve">During this project, we developed an optimization pipeline employing a genetic algorithm to train a multilayer perceptron designed to play the Atari Tennis environment. While the evolved agent did not achieve competitive gameplay and frequently exhibited static </w:t>
-      </w:r>
-      <w:r>
-        <w:rPr>
-          <w:rFonts w:asciiTheme="minorHAnsi" w:hAnsiTheme="minorHAnsi" w:cstheme="minorHAnsi"/>
-          <w:sz w:val="20"/>
-          <w:szCs w:val="20"/>
-          <w:lang w:val="en-GB"/>
-        </w:rPr>
-        <w:t>behaviour</w:t>
-      </w:r>
-      <w:r>
-        <w:rPr>
-          <w:rFonts w:asciiTheme="minorHAnsi" w:hAnsiTheme="minorHAnsi" w:cstheme="minorHAnsi"/>
-          <w:sz w:val="20"/>
-          <w:szCs w:val="20"/>
-          <w:lang w:val="en-GB"/>
-        </w:rPr>
-        <w:t xml:space="preserve">, the project provided critical technical insights into neuroevolutionary training loops, reward engineering, and hyperparameter sensitivity. </w:t>
+        <w:t xml:space="preserve">During this project, we developed an optimization pipeline employing a genetic algorithm to train a multilayer perceptron designed to play the Atari Tennis environment. While the evolved agent did not achieve competitive gameplay and frequently exhibited static behaviour, the project provided critical technical insights into neuroevolutionary training loops, reward engineering, and hyperparameter sensitivity. </w:t>
       </w:r>
     </w:p>
     <w:p>
@@ -3284,6 +3414,7 @@
           <w:ilvl w:val="0"/>
           <w:numId w:val="5"/>
         </w:numPr>
+        <w:ind w:left="708"/>
         <w:jc w:val="left"/>
         <w:rPr>
           <w:rFonts w:asciiTheme="minorHAnsi" w:hAnsiTheme="minorHAnsi" w:cstheme="minorHAnsi"/>
@@ -3299,37 +3430,8 @@
           <w:szCs w:val="20"/>
           <w:lang w:val="en-GB"/>
         </w:rPr>
-        <w:t xml:space="preserve">The Sparse Reward Bottleneck: Reinforcement learning environments like Atari Tennis present severe sparse-reward environments where meaningful game events (scoring or losing a point) happen too infrequently to provide a smooth gradient for early generations. This underscored the necessity of a engineered, progressive multi-objective fitness function to reward foundational </w:t>
-      </w:r>
-      <w:r>
-        <w:rPr>
-          <w:rFonts w:asciiTheme="minorHAnsi" w:hAnsiTheme="minorHAnsi" w:cstheme="minorHAnsi"/>
-          <w:sz w:val="20"/>
-          <w:szCs w:val="20"/>
-          <w:lang w:val="en-GB"/>
-        </w:rPr>
-        <w:t>behaviours</w:t>
-      </w:r>
-      <w:r>
-        <w:rPr>
-          <w:rFonts w:asciiTheme="minorHAnsi" w:hAnsiTheme="minorHAnsi" w:cstheme="minorHAnsi"/>
-          <w:sz w:val="20"/>
-          <w:szCs w:val="20"/>
-          <w:lang w:val="en-GB"/>
-        </w:rPr>
-        <w:t xml:space="preserve"> like ball-tracking. </w:t>
-      </w:r>
-    </w:p>
-    <w:p>
-      <w:pPr>
-        <w:jc w:val="left"/>
-        <w:rPr>
-          <w:rFonts w:asciiTheme="minorHAnsi" w:hAnsiTheme="minorHAnsi" w:cstheme="minorHAnsi"/>
-          <w:sz w:val="20"/>
-          <w:szCs w:val="20"/>
-          <w:lang w:val="en-GB"/>
-        </w:rPr>
-      </w:pPr>
+        <w:t xml:space="preserve">The Sparse Reward Bottleneck: Reinforcement learning environments like Atari Tennis present severe sparse-reward environments where meaningful game events (scoring or losing a point) happen too infrequently to provide a smooth gradient for early generations. This underscored the necessity of a engineered, progressive multi-objective fitness function to reward foundational behaviours like ball-tracking. </w:t>
+      </w:r>
     </w:p>
     <w:sdt>
       <w:sdtPr>
@@ -3381,7 +3483,7 @@
                   <w:noProof/>
                   <w:sz w:val="24"/>
                   <w:szCs w:val="24"/>
-                  <w:lang w:val="en-GB"/>
+                  <w:lang w:val="de-DE"/>
                 </w:rPr>
               </w:pPr>
               <w:r>
@@ -3392,7 +3494,7 @@
               </w:r>
               <w:r>
                 <w:rPr>
-                  <w:lang w:val="en-GB"/>
+                  <w:lang w:val="de-DE"/>
                 </w:rPr>
                 <w:instrText>BIBLIOGRAPHY</w:instrText>
               </w:r>
@@ -3404,19 +3506,48 @@
               </w:r>
               <w:r>
                 <w:rPr>
+                  <w:b/>
+                  <w:bCs/>
                   <w:noProof/>
-                  <w:lang w:val="en-GB"/>
+                  <w:lang w:val="de-DE"/>
                 </w:rPr>
-                <w:t xml:space="preserve">1. </w:t>
+                <w:t>1</w:t>
+              </w:r>
+              <w:r>
+                <w:rPr>
+                  <w:noProof/>
+                  <w:lang w:val="de-DE"/>
+                </w:rPr>
+                <w:t xml:space="preserve">. </w:t>
               </w:r>
               <w:r>
                 <w:rPr>
                   <w:b/>
                   <w:bCs/>
                   <w:noProof/>
-                  <w:lang w:val="en-GB"/>
+                  <w:lang w:val="de-DE"/>
                 </w:rPr>
-                <w:t>[Online] https://ale.farama.org/environments/tennis/.</w:t>
+                <w:t xml:space="preserve">https://github.com/DemiFiend01/Tennis_gen_algorithm.git. [Online] </w:t>
+              </w:r>
+            </w:p>
+            <w:p>
+              <w:pPr>
+                <w:pStyle w:val="Bibliografia"/>
+                <w:rPr>
+                  <w:b/>
+                  <w:bCs/>
+                  <w:noProof/>
+                  <w:lang w:val="de-DE"/>
+                </w:rPr>
+              </w:pPr>
+              <w:r>
+                <w:rPr>
+                  <w:b/>
+                  <w:bCs/>
+                  <w:noProof/>
+                  <w:lang w:val="de-DE"/>
+                </w:rPr>
+                <w:t>2. [Online] https://ale.farama.org/environments/tennis/.</w:t>
               </w:r>
             </w:p>
             <w:p>
@@ -3436,7 +3567,7 @@
                   <w:noProof/>
                   <w:lang w:val="en-GB"/>
                 </w:rPr>
-                <w:t>2. PyGad. [Online] https://pygad.readthedocs.io/en/latest/.</w:t>
+                <w:t>3. PyGad. [Online] https://pygad.readthedocs.io/en/latest/.</w:t>
               </w:r>
             </w:p>
             <w:p>
@@ -4789,6 +4920,7 @@
   <w:style w:type="character" w:default="1" w:styleId="Domylnaczcionkaakapitu">
     <w:name w:val="Default Paragraph Font"/>
     <w:uiPriority w:val="1"/>
+    <w:semiHidden/>
     <w:unhideWhenUsed/>
   </w:style>
   <w:style w:type="table" w:default="1" w:styleId="Standardowy">
@@ -5550,7 +5682,7 @@
     <b:Guid>{106A5E77-BF30-4D44-B3AE-E4C05AEB7B48}</b:Guid>
     <b:LCID>en-GB</b:LCID>
     <b:URL>https://ale.farama.org/environments/tennis/</b:URL>
-    <b:RefOrder>1</b:RefOrder>
+    <b:RefOrder>2</b:RefOrder>
   </b:Source>
   <b:Source>
     <b:Tag>PyG</b:Tag>
@@ -5558,13 +5690,20 @@
     <b:Guid>{0B3600CE-CC1E-49C4-B07E-6EFFEEB61BA7}</b:Guid>
     <b:Title>PyGad</b:Title>
     <b:URL>https://pygad.readthedocs.io/en/latest/</b:URL>
-    <b:RefOrder>2</b:RefOrder>
+    <b:RefOrder>3</b:RefOrder>
+  </b:Source>
+  <b:Source>
+    <b:Tag>htt13</b:Tag>
+    <b:SourceType>InternetSite</b:SourceType>
+    <b:Guid>{1597DCA3-27DD-4BEA-BE9D-BB421308355C}</b:Guid>
+    <b:Title>https://github.com/DemiFiend01/Tennis_gen_algorithm.git</b:Title>
+    <b:RefOrder>1</b:RefOrder>
   </b:Source>
 </b:Sources>
 </file>
 
 <file path=customXml/itemProps1.xml><?xml version="1.0" encoding="utf-8"?>
-<ds:datastoreItem xmlns:ds="http://schemas.openxmlformats.org/officeDocument/2006/customXml" ds:itemID="{EAAAF772-AD98-4330-9377-41D8BE03E323}">
+<ds:datastoreItem xmlns:ds="http://schemas.openxmlformats.org/officeDocument/2006/customXml" ds:itemID="{FF9DD18B-6527-4BD6-A0AE-BA2B35DF612F}">
   <ds:schemaRefs>
     <ds:schemaRef ds:uri="http://schemas.openxmlformats.org/officeDocument/2006/bibliography"/>
   </ds:schemaRefs>

</xml_diff>